<commit_message>
docs: add GitHub repository link to documentation
</commit_message>
<xml_diff>
--- a/RoadWatch_AI_Documentation.docx
+++ b/RoadWatch_AI_Documentation.docx
@@ -29,6 +29,11 @@
       </w:pPr>
       <w:r>
         <w:t>2. Project Overview</w:t>
+      </w:r>
+    </w:p>
+    <w:p>
+      <w:r>
+        <w:t>GitHub Repository: https://github.com/vanmughilan0622-lab/RoadWatch_AI</w:t>
       </w:r>
     </w:p>
     <w:p>

</xml_diff>